<commit_message>
feat: harden WPS recognition and formatting workflow
</commit_message>
<xml_diff>
--- a/tests/fixtures/01-before-format.docx
+++ b/tests/fixtures/01-before-format.docx
@@ -33,8 +33,13 @@
       </w:r>
     </w:p>
     <w:p>
+      <w:commentRangeStart w:id="0"/>
       <w:r>
         <w:t>普通正文测试段落：这是脱敏示例文字，用于验证正文格式是否写入。</w:t>
+      </w:r>
+      <w:commentRangeEnd w:id="0"/>
+      <w:r>
+        <w:commentReference w:id="0"/>
       </w:r>
     </w:p>
     <w:p>
@@ -179,12 +184,24 @@
       </w:r>
     </w:p>
     <w:sectPr>
-      <w:pgSz w:w="15840" w:h="12240" w:orient="landscape"/>
+      <w:pgSz w:w="12240" w:h="15840"/>
       <w:pgMar w:top="1440" w:right="1800" w:bottom="1440" w:left="1800" w:header="720" w:footer="720" w:gutter="0"/>
       <w:cols w:space="720"/>
     </w:sectPr>
   </w:body>
 </w:document>
+</file>
+
+<file path=word/comments.xml><?xml version="1.0" encoding="utf-8"?>
+<w:comments xmlns:w="http://schemas.openxmlformats.org/wordprocessingml/2006/main">
+  <w:comment w:id="0" w:author="验收用户" w:initials="YS" w:date="2026-07-31T01:10:04.782095+00:00">
+    <w:p>
+      <w:r>
+        <w:t>用户保留批注：此批注必须在预览和一键排版后保持。</w:t>
+      </w:r>
+    </w:p>
+  </w:comment>
+</w:comments>
 </file>
 
 <file path=word/numbering.xml><?xml version="1.0" encoding="utf-8"?>

</xml_diff>